<commit_message>
added final tables, fixing weights name
</commit_message>
<xml_diff>
--- a/Stat_Modeling/running_model/spatial_durbin_models_all.docx
+++ b/Stat_Modeling/running_model/spatial_durbin_models_all.docx
@@ -37,7 +37,7 @@
         <w:br/>
         <w:t>Data set            :harris_county</w:t>
         <w:br/>
-        <w:t>Weights matrix      : knn_weights</w:t>
+        <w:t>Weights matrix      :queen_contig</w:t>
         <w:br/>
         <w:t>Dependent Variable  :pct_diabetes                Number of Observations:        1271</w:t>
         <w:br/>
@@ -154,7 +154,7 @@
         <w:br/>
         <w:t>Data set            :dallas_county</w:t>
         <w:br/>
-        <w:t>Weights matrix      : knn_weights</w:t>
+        <w:t>Weights matrix      :queen_contig</w:t>
         <w:br/>
         <w:t>Dependent Variable  :pct_diabetes                Number of Observations:         659</w:t>
         <w:br/>
@@ -271,23 +271,23 @@
         <w:br/>
         <w:t>Data set            :tarrant_county</w:t>
         <w:br/>
-        <w:t>Weights matrix      : knn_weights</w:t>
-        <w:br/>
-        <w:t>Dependent Variable  :pct_diabetes                Number of Observations:         458</w:t>
-        <w:br/>
-        <w:t>Mean dependent var  :     10.8961                Number of Variables   :          16</w:t>
-        <w:br/>
-        <w:t>S.D. dependent var  :     47.4100                Degrees of Freedom    :         442</w:t>
-        <w:br/>
-        <w:t>Pseudo R-squared    :      0.0419</w:t>
-        <w:br/>
-        <w:t>Spatial Pseudo R-squared:  0.0390</w:t>
-        <w:br/>
-        <w:t>Log likelihood      :  -2407.1183</w:t>
-        <w:br/>
-        <w:t>Sigma-square ML     :   2148.8613                Akaike info criterion :    4846.237</w:t>
-        <w:br/>
-        <w:t>S.E of regression   :     46.3558                Schwarz criterion     :    4912.266</w:t>
+        <w:t>Weights matrix      :queen_contig</w:t>
+        <w:br/>
+        <w:t>Dependent Variable  :pct_diabetes                Number of Observations:         457</w:t>
+        <w:br/>
+        <w:t>Mean dependent var  :     13.1059                Number of Variables   :          16</w:t>
+        <w:br/>
+        <w:t>S.D. dependent var  :      3.3380                Degrees of Freedom    :         441</w:t>
+        <w:br/>
+        <w:t>Pseudo R-squared    :      0.7177</w:t>
+        <w:br/>
+        <w:t>Spatial Pseudo R-squared:  0.5030</w:t>
+        <w:br/>
+        <w:t>Log likelihood      :   -937.7096</w:t>
+        <w:br/>
+        <w:t>Sigma-square ML     :      3.1692                Akaike info criterion :    1907.419</w:t>
+        <w:br/>
+        <w:t>S.E of regression   :      1.7802                Schwarz criterion     :    1973.414</w:t>
         <w:br/>
         <w:br/>
         <w:t>------------------------------------------------------------------------------------</w:t>
@@ -296,37 +296,37 @@
         <w:br/>
         <w:t>------------------------------------------------------------------------------------</w:t>
         <w:br/>
-        <w:t xml:space="preserve">            CONSTANT       356.26275       134.00204         2.65864         0.00785</w:t>
-        <w:br/>
-        <w:t>distance_to_nearest_uf         0.00041         0.00091         0.45449         0.64948</w:t>
-        <w:br/>
-        <w:t>distance_to_nearest_grocery         0.00006         0.00089         0.07176         0.94279</w:t>
-        <w:br/>
-        <w:t>distance_to_nearest_fm         0.00065         0.00082         0.79509         0.42656</w:t>
-        <w:br/>
-        <w:t xml:space="preserve">          log_income       -15.78405         9.38728        -1.68143         0.09268</w:t>
-        <w:br/>
-        <w:t xml:space="preserve">      pct_no_vehicle        -0.52194         0.49800        -1.04809         0.29460</w:t>
-        <w:br/>
-        <w:t xml:space="preserve">          median_age         0.89591         0.45288         1.97826         0.04790</w:t>
-        <w:br/>
-        <w:t xml:space="preserve">         walking_ind        -1.45745         1.60831        -0.90620         0.36483</w:t>
-        <w:br/>
-        <w:t>W_distance_to_nearest_uf        -0.00093         0.00098        -0.94718         0.34355</w:t>
-        <w:br/>
-        <w:t>W_distance_to_nearest_grocery         0.00053         0.00146         0.36293         0.71666</w:t>
-        <w:br/>
-        <w:t>W_distance_to_nearest_fm        -0.00053         0.00086        -0.61434         0.53899</w:t>
-        <w:br/>
-        <w:t xml:space="preserve">        W_log_income       -16.94000        14.57623        -1.16217         0.24517</w:t>
-        <w:br/>
-        <w:t xml:space="preserve">    W_pct_no_vehicle         0.25114         1.09895         0.22853         0.81924</w:t>
-        <w:br/>
-        <w:t xml:space="preserve">        W_median_age         0.51191         0.86935         0.58884         0.55597</w:t>
-        <w:br/>
-        <w:t xml:space="preserve">       W_walking_ind        -0.22600         2.26563        -0.09975         0.92054</w:t>
-        <w:br/>
-        <w:t xml:space="preserve">      W_pct_diabetes        -0.07515         0.08356        -0.89934         0.36847</w:t>
+        <w:t xml:space="preserve">            CONSTANT        30.59071         6.28761         4.86524         0.00000</w:t>
+        <w:br/>
+        <w:t>distance_to_nearest_uf        -0.00007         0.00004        -2.01394         0.04402</w:t>
+        <w:br/>
+        <w:t>distance_to_nearest_grocery         0.00002         0.00003         0.57718         0.56382</w:t>
+        <w:br/>
+        <w:t>distance_to_nearest_fm        -0.00002         0.00003        -0.58845         0.55623</w:t>
+        <w:br/>
+        <w:t xml:space="preserve">          log_income        -2.23764         0.36209        -6.17973         0.00000</w:t>
+        <w:br/>
+        <w:t xml:space="preserve">      pct_no_vehicle        -0.00573         0.01915        -0.29930         0.76471</w:t>
+        <w:br/>
+        <w:t xml:space="preserve">          median_age         0.10603         0.01743         6.08157         0.00000</w:t>
+        <w:br/>
+        <w:t xml:space="preserve">         walking_ind         0.05643         0.06185         0.91240         0.36156</w:t>
+        <w:br/>
+        <w:t>W_distance_to_nearest_uf         0.00005         0.00004         1.35901         0.17414</w:t>
+        <w:br/>
+        <w:t>W_distance_to_nearest_grocery        -0.00005         0.00006        -0.83265         0.40504</w:t>
+        <w:br/>
+        <w:t>W_distance_to_nearest_fm         0.00001         0.00003         0.43666         0.66236</w:t>
+        <w:br/>
+        <w:t xml:space="preserve">        W_log_income        -0.15781         0.61401        -0.25701         0.79717</w:t>
+        <w:br/>
+        <w:t xml:space="preserve">    W_pct_no_vehicle        -0.01507         0.04218        -0.35737         0.72082</w:t>
+        <w:br/>
+        <w:t xml:space="preserve">        W_median_age        -0.06129         0.03385        -1.81082         0.07017</w:t>
+        <w:br/>
+        <w:t xml:space="preserve">       W_walking_ind        -0.11077         0.08710        -1.27181         0.20344</w:t>
+        <w:br/>
+        <w:t xml:space="preserve">      W_pct_diabetes         0.72227         0.04082        17.69424         0.00000</w:t>
         <w:br/>
         <w:t>------------------------------------------------------------------------------------</w:t>
         <w:br/>
@@ -335,7 +335,7 @@
         <w:br/>
         <w:t>TEST                              DF         VALUE           PROB</w:t>
         <w:br/>
-        <w:t>Common Factor Hypothesis Test     7          3.081           0.8774</w:t>
+        <w:t>Common Factor Hypothesis Test     7         22.733           0.0019</w:t>
         <w:br/>
         <w:br/>
         <w:t>SPATIAL DURBIN MODEL IMPACTS</w:t>
@@ -344,19 +344,19 @@
         <w:br/>
         <w:t xml:space="preserve">            Variable         Direct        Indirect          Total</w:t>
         <w:br/>
-        <w:t>distance_to_nearest_uf         0.0004         -0.0009         -0.0005</w:t>
-        <w:br/>
-        <w:t>distance_to_nearest_grocery         0.0001          0.0005          0.0006</w:t>
-        <w:br/>
-        <w:t>distance_to_nearest_fm         0.0007         -0.0005          0.0001</w:t>
-        <w:br/>
-        <w:t xml:space="preserve">          log_income       -15.7841        -14.6527        -30.4367</w:t>
-        <w:br/>
-        <w:t xml:space="preserve">      pct_no_vehicle        -0.5219          0.2701         -0.2519</w:t>
-        <w:br/>
-        <w:t xml:space="preserve">          median_age         0.8959          0.4135          1.3094</w:t>
-        <w:br/>
-        <w:t xml:space="preserve">         walking_ind        -1.4574         -0.1083         -1.5658</w:t>
+        <w:t>distance_to_nearest_uf        -0.0001          0.0000         -0.0001</w:t>
+        <w:br/>
+        <w:t>distance_to_nearest_grocery         0.0000         -0.0001         -0.0001</w:t>
+        <w:br/>
+        <w:t>distance_to_nearest_fm        -0.0000          0.0000         -0.0000</w:t>
+        <w:br/>
+        <w:t xml:space="preserve">          log_income        -2.2376         -6.3873         -8.6250</w:t>
+        <w:br/>
+        <w:t xml:space="preserve">      pct_no_vehicle        -0.0057         -0.0692         -0.0749</w:t>
+        <w:br/>
+        <w:t xml:space="preserve">          median_age         0.1060          0.0551          0.1611</w:t>
+        <w:br/>
+        <w:t xml:space="preserve">         walking_ind         0.0564         -0.2521         -0.1957</w:t>
         <w:br/>
         <w:t>================================ END OF REPORT =====================================</w:t>
       </w:r>
@@ -388,23 +388,23 @@
         <w:br/>
         <w:t>Data set            :bexar_county</w:t>
         <w:br/>
-        <w:t>Weights matrix      : knn_weights</w:t>
-        <w:br/>
-        <w:t>Dependent Variable  :pct_diabetes                Number of Observations:         384</w:t>
-        <w:br/>
-        <w:t>Mean dependent var  :     13.7542                Number of Variables   :          16</w:t>
-        <w:br/>
-        <w:t>S.D. dependent var  :     52.0397                Degrees of Freedom    :         368</w:t>
-        <w:br/>
-        <w:t>Pseudo R-squared    :      0.0751</w:t>
-        <w:br/>
-        <w:t>Spatial Pseudo R-squared:  0.0740</w:t>
-        <w:br/>
-        <w:t>Log likelihood      :  -2047.0347</w:t>
-        <w:br/>
-        <w:t>Sigma-square ML     :   2498.2235                Akaike info criterion :    4126.069</w:t>
-        <w:br/>
-        <w:t>S.E of regression   :     49.9822                Schwarz criterion     :    4189.280</w:t>
+        <w:t>Weights matrix      :queen_contig</w:t>
+        <w:br/>
+        <w:t>Dependent Variable  :pct_diabetes                Number of Observations:         383</w:t>
+        <w:br/>
+        <w:t>Mean dependent var  :     16.3984                Number of Variables   :          16</w:t>
+        <w:br/>
+        <w:t>S.D. dependent var  :      4.8178                Degrees of Freedom    :         367</w:t>
+        <w:br/>
+        <w:t>Pseudo R-squared    :      0.7962</w:t>
+        <w:br/>
+        <w:t>Spatial Pseudo R-squared:  0.6740</w:t>
+        <w:br/>
+        <w:t>Log likelihood      :   -861.4599</w:t>
+        <w:br/>
+        <w:t>Sigma-square ML     :      4.7411                Akaike info criterion :    1754.920</w:t>
+        <w:br/>
+        <w:t>S.E of regression   :      2.1774                Schwarz criterion     :    1818.088</w:t>
         <w:br/>
         <w:br/>
         <w:t>------------------------------------------------------------------------------------</w:t>
@@ -413,37 +413,37 @@
         <w:br/>
         <w:t>------------------------------------------------------------------------------------</w:t>
         <w:br/>
-        <w:t xml:space="preserve">            CONSTANT       419.90640       185.96121         2.25803         0.02394</w:t>
-        <w:br/>
-        <w:t>distance_to_nearest_uf        -0.00019         0.00087        -0.21663         0.82849</w:t>
-        <w:br/>
-        <w:t>distance_to_nearest_grocery        -0.00250         0.00098        -2.55189         0.01071</w:t>
-        <w:br/>
-        <w:t>distance_to_nearest_fm         0.00064         0.00102         0.63157         0.52767</w:t>
-        <w:br/>
-        <w:t xml:space="preserve">          log_income        -4.30906        10.52952        -0.40924         0.68237</w:t>
-        <w:br/>
-        <w:t xml:space="preserve">      pct_no_vehicle        -0.15207         0.55434        -0.27432         0.78384</w:t>
-        <w:br/>
-        <w:t xml:space="preserve">          median_age        -0.59593         0.48000        -1.24150         0.21442</w:t>
-        <w:br/>
-        <w:t xml:space="preserve">         walking_ind         1.24693         1.65849         0.75184         0.45214</w:t>
-        <w:br/>
-        <w:t>W_distance_to_nearest_uf        -0.00026         0.00099        -0.26000         0.79486</w:t>
-        <w:br/>
-        <w:t>W_distance_to_nearest_grocery         0.00180         0.00175         1.02920         0.30338</w:t>
-        <w:br/>
-        <w:t>W_distance_to_nearest_fm        -0.00040         0.00111        -0.35814         0.72024</w:t>
-        <w:br/>
-        <w:t xml:space="preserve">        W_log_income       -31.84653        19.01391        -1.67491         0.09395</w:t>
-        <w:br/>
-        <w:t xml:space="preserve">    W_pct_no_vehicle        -1.42678         1.08130        -1.31950         0.18700</w:t>
-        <w:br/>
-        <w:t xml:space="preserve">        W_median_age         0.67577         1.09305         0.61825         0.53641</w:t>
-        <w:br/>
-        <w:t xml:space="preserve">       W_walking_ind         0.02033         2.91260         0.00698         0.99443</w:t>
-        <w:br/>
-        <w:t xml:space="preserve">      W_pct_diabetes        -0.05337         0.09203        -0.57994         0.56196</w:t>
+        <w:t xml:space="preserve">            CONSTANT        44.98471         9.69975         4.63772         0.00000</w:t>
+        <w:br/>
+        <w:t>distance_to_nearest_uf         0.00005         0.00004         1.31809         0.18747</w:t>
+        <w:br/>
+        <w:t>distance_to_nearest_grocery        -0.00004         0.00004        -0.99223         0.32108</w:t>
+        <w:br/>
+        <w:t>distance_to_nearest_fm         0.00000         0.00004         0.05089         0.95941</w:t>
+        <w:br/>
+        <w:t xml:space="preserve">          log_income        -3.83740         0.46051        -8.33288         0.00000</w:t>
+        <w:br/>
+        <w:t xml:space="preserve">      pct_no_vehicle         0.04014         0.02415         1.66219         0.09647</w:t>
+        <w:br/>
+        <w:t xml:space="preserve">          median_age         0.21848         0.02102        10.39583         0.00000</w:t>
+        <w:br/>
+        <w:t xml:space="preserve">         walking_ind         0.01193         0.07223         0.16522         0.86877</w:t>
+        <w:br/>
+        <w:t>W_distance_to_nearest_uf        -0.00005         0.00004        -1.04617         0.29548</w:t>
+        <w:br/>
+        <w:t>W_distance_to_nearest_grocery         0.00009         0.00008         1.20510         0.22817</w:t>
+        <w:br/>
+        <w:t>W_distance_to_nearest_fm        -0.00000         0.00005        -0.09526         0.92411</w:t>
+        <w:br/>
+        <w:t xml:space="preserve">        W_log_income        -0.18165         0.92713        -0.19593         0.84467</w:t>
+        <w:br/>
+        <w:t xml:space="preserve">    W_pct_no_vehicle        -0.08203         0.04715        -1.73980         0.08189</w:t>
+        <w:br/>
+        <w:t xml:space="preserve">        W_median_age        -0.09646         0.04960        -1.94470         0.05181</w:t>
+        <w:br/>
+        <w:t xml:space="preserve">       W_walking_ind        -0.00625         0.12678        -0.04928         0.96070</w:t>
+        <w:br/>
+        <w:t xml:space="preserve">      W_pct_diabetes         0.70887         0.04664        15.19767         0.00000</w:t>
         <w:br/>
         <w:t>------------------------------------------------------------------------------------</w:t>
         <w:br/>
@@ -452,7 +452,7 @@
         <w:br/>
         <w:t>TEST                              DF         VALUE           PROB</w:t>
         <w:br/>
-        <w:t>Common Factor Hypothesis Test     7          5.545           0.5937</w:t>
+        <w:t>Common Factor Hypothesis Test     7         22.252           0.0023</w:t>
         <w:br/>
         <w:br/>
         <w:t>SPATIAL DURBIN MODEL IMPACTS</w:t>
@@ -461,19 +461,19 @@
         <w:br/>
         <w:t xml:space="preserve">            Variable         Direct        Indirect          Total</w:t>
         <w:br/>
-        <w:t>distance_to_nearest_uf        -0.0002         -0.0002         -0.0004</w:t>
-        <w:br/>
-        <w:t>distance_to_nearest_grocery        -0.0025          0.0018         -0.0007</w:t>
-        <w:br/>
-        <w:t>distance_to_nearest_fm         0.0006         -0.0004          0.0002</w:t>
-        <w:br/>
-        <w:t xml:space="preserve">          log_income        -4.3091        -30.0146        -34.3236</w:t>
-        <w:br/>
-        <w:t xml:space="preserve">      pct_no_vehicle        -0.1521         -1.3468         -1.4989</w:t>
-        <w:br/>
-        <w:t xml:space="preserve">          median_age        -0.5959          0.6717          0.0758</w:t>
-        <w:br/>
-        <w:t xml:space="preserve">         walking_ind         1.2469         -0.0439          1.2030</w:t>
+        <w:t>distance_to_nearest_uf         0.0001         -0.0000          0.0000</w:t>
+        <w:br/>
+        <w:t>distance_to_nearest_grocery        -0.0000          0.0002          0.0002</w:t>
+        <w:br/>
+        <w:t>distance_to_nearest_fm         0.0000         -0.0000         -0.0000</w:t>
+        <w:br/>
+        <w:t xml:space="preserve">          log_income        -3.8374         -9.9677        -13.8051</w:t>
+        <w:br/>
+        <w:t xml:space="preserve">      pct_no_vehicle         0.0401         -0.1840         -0.1439</w:t>
+        <w:br/>
+        <w:t xml:space="preserve">          median_age         0.2185          0.2006          0.4191</w:t>
+        <w:br/>
+        <w:t xml:space="preserve">         walking_ind         0.0119          0.0076          0.0195</w:t>
         <w:br/>
         <w:t>================================ END OF REPORT =====================================</w:t>
       </w:r>
@@ -505,7 +505,7 @@
         <w:br/>
         <w:t>Data set            :travis_county</w:t>
         <w:br/>
-        <w:t>Weights matrix      : knn_weights</w:t>
+        <w:t>Weights matrix      :queen_contig</w:t>
         <w:br/>
         <w:t>Dependent Variable  :pct_diabetes                Number of Observations:         305</w:t>
         <w:br/>

</xml_diff>